<commit_message>
Adds Presentation and Updated Report
</commit_message>
<xml_diff>
--- a/Documents/Submissions/Report-Thesis-I-24k-8021.docx
+++ b/Documents/Submissions/Report-Thesis-I-24k-8021.docx
@@ -500,6 +500,64 @@
           <w14:ligatures w14:val="none"/>
         </w:rPr>
       </w:pPr>
+      <w:r>
+        <w:rPr>
+          <w:rFonts w:asciiTheme="majorBidi" w:eastAsia="Times New Roman" w:hAnsiTheme="majorBidi" w:cstheme="majorBidi"/>
+          <w:kern w:val="0"/>
+          <w:sz w:val="28"/>
+          <w:szCs w:val="28"/>
+          <w14:ligatures w14:val="none"/>
+        </w:rPr>
+        <w:drawing>
+          <wp:anchor distT="0" distB="0" distL="114300" distR="114300" simplePos="0" relativeHeight="251665408" behindDoc="0" locked="0" layoutInCell="1" allowOverlap="1" wp14:anchorId="5A6CD854" wp14:editId="17CDA41B">
+            <wp:simplePos x="0" y="0"/>
+            <wp:positionH relativeFrom="margin">
+              <wp:posOffset>4392599</wp:posOffset>
+            </wp:positionH>
+            <wp:positionV relativeFrom="paragraph">
+              <wp:posOffset>6543</wp:posOffset>
+            </wp:positionV>
+            <wp:extent cx="1181100" cy="1123950"/>
+            <wp:effectExtent l="0" t="0" r="0" b="0"/>
+            <wp:wrapNone/>
+            <wp:docPr id="1704725160" name="Picture 1"/>
+            <wp:cNvGraphicFramePr>
+              <a:graphicFrameLocks xmlns:a="http://schemas.openxmlformats.org/drawingml/2006/main" noChangeAspect="1"/>
+            </wp:cNvGraphicFramePr>
+            <a:graphic xmlns:a="http://schemas.openxmlformats.org/drawingml/2006/main">
+              <a:graphicData uri="http://schemas.openxmlformats.org/drawingml/2006/picture">
+                <pic:pic xmlns:pic="http://schemas.openxmlformats.org/drawingml/2006/picture">
+                  <pic:nvPicPr>
+                    <pic:cNvPr id="1704725160" name=""/>
+                    <pic:cNvPicPr/>
+                  </pic:nvPicPr>
+                  <pic:blipFill>
+                    <a:blip r:embed="rId9">
+                      <a:extLst>
+                        <a:ext uri="{28A0092B-C50C-407E-A947-70E740481C1C}">
+                          <a14:useLocalDpi xmlns:a14="http://schemas.microsoft.com/office/drawing/2010/main" val="0"/>
+                        </a:ext>
+                      </a:extLst>
+                    </a:blip>
+                    <a:stretch>
+                      <a:fillRect/>
+                    </a:stretch>
+                  </pic:blipFill>
+                  <pic:spPr>
+                    <a:xfrm>
+                      <a:off x="0" y="0"/>
+                      <a:ext cx="1181100" cy="1123950"/>
+                    </a:xfrm>
+                    <a:prstGeom prst="rect">
+                      <a:avLst/>
+                    </a:prstGeom>
+                  </pic:spPr>
+                </pic:pic>
+              </a:graphicData>
+            </a:graphic>
+          </wp:anchor>
+        </w:drawing>
+      </w:r>
     </w:p>
     <w:p>
       <w:pPr>
@@ -580,6 +638,12 @@
           <w14:ligatures w14:val="none"/>
         </w:rPr>
         <w:t>: S M Imran Abbas (24K-8021)</w:t>
+      </w:r>
+      <w:r>
+        <w:rPr>
+          <w:noProof/>
+        </w:rPr>
+        <w:t xml:space="preserve"> </w:t>
       </w:r>
     </w:p>
     <w:p>
@@ -11236,7 +11300,7 @@
                     <pic:cNvPicPr/>
                   </pic:nvPicPr>
                   <pic:blipFill>
-                    <a:blip r:embed="rId9">
+                    <a:blip r:embed="rId10">
                       <a:extLst>
                         <a:ext uri="{28A0092B-C50C-407E-A947-70E740481C1C}">
                           <a14:useLocalDpi xmlns:a14="http://schemas.microsoft.com/office/drawing/2010/main" val="0"/>
@@ -14531,7 +14595,7 @@
                     <pic:cNvPicPr/>
                   </pic:nvPicPr>
                   <pic:blipFill>
-                    <a:blip r:embed="rId10">
+                    <a:blip r:embed="rId11">
                       <a:extLst>
                         <a:ext uri="{28A0092B-C50C-407E-A947-70E740481C1C}">
                           <a14:useLocalDpi xmlns:a14="http://schemas.microsoft.com/office/drawing/2010/main" val="0"/>
@@ -17855,12 +17919,12 @@
       </w:pPr>
     </w:p>
     <w:sectPr>
-      <w:headerReference w:type="even" r:id="rId11"/>
-      <w:headerReference w:type="default" r:id="rId12"/>
-      <w:footerReference w:type="even" r:id="rId13"/>
-      <w:footerReference w:type="default" r:id="rId14"/>
-      <w:headerReference w:type="first" r:id="rId15"/>
-      <w:footerReference w:type="first" r:id="rId16"/>
+      <w:headerReference w:type="even" r:id="rId12"/>
+      <w:headerReference w:type="default" r:id="rId13"/>
+      <w:footerReference w:type="even" r:id="rId14"/>
+      <w:footerReference w:type="default" r:id="rId15"/>
+      <w:headerReference w:type="first" r:id="rId16"/>
+      <w:footerReference w:type="first" r:id="rId17"/>
       <w:pgSz w:w="11906" w:h="16838" w:code="9"/>
       <w:pgMar w:top="1440" w:right="1440" w:bottom="1440" w:left="1440" w:header="720" w:footer="720" w:gutter="0"/>
       <w:cols w:space="720"/>

</xml_diff>